<commit_message>
docs: repair player guide docx
</commit_message>
<xml_diff>
--- a/docs/player-guide.docx
+++ b/docs/player-guide.docx
@@ -19561,7 +19561,6 @@
     </w:tbl>
     <w:p/>
     <w:sectPr>
-      <w:footerReference w:type="default" r:id="rId9"/>
       <w:pgSz w:w="12240" w:h="15840"/>
       <w:pgMar w:top="1440" w:right="1440" w:bottom="1440" w:left="1440" w:header="708" w:footer="708" w:gutter="0"/>
       <w:cols w:space="720"/>
@@ -19569,36 +19568,6 @@
     </w:sectPr>
   </w:body>
 </w:document>
-</file>
-
-<file path=word/footer1.xml><?xml version="1.0" encoding="utf-8"?>
-<w:ftr xmlns:m="http://schemas.openxmlformats.org/officeDocument/2006/math" xmlns:mc="http://schemas.openxmlformats.org/markup-compatibility/2006" xmlns:mo="http://schemas.microsoft.com/office/mac/office/2008/main" xmlns:mv="urn:schemas-microsoft-com:mac:vml" xmlns:o="urn:schemas-microsoft-com:office:office" xmlns:r="http://schemas.openxmlformats.org/officeDocument/2006/relationships" xmlns:v="urn:schemas-microsoft-com:vml" xmlns:w10="urn:schemas-microsoft-com:office:word" xmlns:w14="http://schemas.microsoft.com/office/word/2010/wordml" xmlns:w="http://schemas.openxmlformats.org/wordprocessingml/2006/main" xmlns:wne="http://schemas.microsoft.com/office/word/2006/wordml" xmlns:wp14="http://schemas.microsoft.com/office/word/2010/wordprocessingDrawing" xmlns:wp="http://schemas.openxmlformats.org/drawingml/2006/wordprocessingDrawing" xmlns:wpc="http://schemas.microsoft.com/office/word/2010/wordprocessingCanvas" xmlns:wpg="http://schemas.microsoft.com/office/word/2010/wordprocessingGroup" xmlns:wpi="http://schemas.microsoft.com/office/word/2010/wordprocessingInk" xmlns:wps="http://schemas.microsoft.com/office/word/2010/wordprocessingShape" mc:Ignorable="w14 wp14">
-  <w:p>
-    <w:pPr>
-      <w:pStyle w:val="Footer"/>
-      <w:jc w:val="right"/>
-    </w:pPr>
-    <w:r>
-      <w:rPr>
-        <w:rFonts w:ascii="Calibri" w:hAnsi="Calibri" w:eastAsia="Microsoft YaHei"/>
-        <w:color w:val="555555"/>
-        <w:sz w:val="18"/>
-      </w:rPr>
-      <w:t xml:space="preserve">第 </w:t>
-    </w:r>
-    <w:fldChar w:fldCharType="begin"/>
-    <w:instrText xml:space="preserve">PAGE</w:instrText>
-    <w:fldChar w:fldCharType="end"/>
-    <w:r>
-      <w:rPr>
-        <w:rFonts w:ascii="Calibri" w:hAnsi="Calibri" w:eastAsia="Microsoft YaHei"/>
-        <w:color w:val="555555"/>
-        <w:sz w:val="18"/>
-      </w:rPr>
-      <w:t xml:space="preserve"> 页</w:t>
-    </w:r>
-  </w:p>
-</w:ftr>
 </file>
 
 <file path=word/numbering.xml><?xml version="1.0" encoding="utf-8"?>

</xml_diff>